<commit_message>
Update Actividades.docx; remove manual copy
Modify binary Actividades.docx (content updated) and delete 'Manual de operaciones - copia.docx'. Removes the duplicate manual copy and updates the activities document.
</commit_message>
<xml_diff>
--- a/Actividades.docx
+++ b/Actividades.docx
@@ -44,6 +44,9 @@
       <w:r>
         <w:t>Mejorar el modelo y ver cómo cambia el ETL</w:t>
       </w:r>
+      <w:r>
+        <w:t>.</w:t>
+      </w:r>
     </w:p>
     <w:p>
       <w:pPr>
@@ -54,31 +57,21 @@
         </w:numPr>
       </w:pPr>
       <w:r>
-        <w:t>Eliminar el git actual y armar otro con una plantilla general o esqueleto para todos los clientes.</w:t>
+        <w:t>Hacer</w:t>
+      </w:r>
+      <w:r>
+        <w:t xml:space="preserve"> lo del diagrama del modelo</w:t>
+      </w:r>
+      <w:r>
+        <w:t>.</w:t>
       </w:r>
     </w:p>
     <w:p>
-      <w:pPr>
-        <w:pStyle w:val="Prrafodelista"/>
-        <w:numPr>
-          <w:ilvl w:val="0"/>
-          <w:numId w:val="2"/>
-        </w:numPr>
-      </w:pPr>
-      <w:r>
-        <w:t>Hacer</w:t>
-      </w:r>
-      <w:r>
-        <w:t xml:space="preserve"> lo del diagrama del modelo</w:t>
-      </w:r>
-      <w:r>
-        <w:t>.</w:t>
-      </w:r>
-    </w:p>
-    <w:p>
+      <w:proofErr w:type="spellStart"/>
       <w:r>
         <w:t>Victor</w:t>
       </w:r>
+      <w:proofErr w:type="spellEnd"/>
     </w:p>
     <w:p>
       <w:pPr>

</xml_diff>